<commit_message>
Update Product Requirement Document (PRD) in DOCX and PDF formats
</commit_message>
<xml_diff>
--- a/Report1_Product_Requirement_Document.docx
+++ b/Report1_Product_Requirement_Document.docx
@@ -14,12 +14,12 @@
           <wp:inline distB="114300" distT="114300" distL="114300" distR="114300">
             <wp:extent cx="2733675" cy="1148612"/>
             <wp:effectExtent b="0" l="0" r="0" t="0"/>
-            <wp:docPr id="8" name="image1.png"/>
+            <wp:docPr id="8" name="image2.png"/>
             <a:graphic>
               <a:graphicData uri="http://schemas.openxmlformats.org/drawingml/2006/picture">
                 <pic:pic>
                   <pic:nvPicPr>
-                    <pic:cNvPr id="0" name="image1.png"/>
+                    <pic:cNvPr id="0" name="image2.png"/>
                     <pic:cNvPicPr preferRelativeResize="0"/>
                   </pic:nvPicPr>
                   <pic:blipFill>
@@ -81,7 +81,7 @@
           <w:szCs w:val="56"/>
           <w:rtl w:val="0"/>
         </w:rPr>
-        <w:t xml:space="preserve">ANOMALYX - TRANSACTION ANOMALY DETECTOR (AML) PROTOTYPE</w:t>
+        <w:t xml:space="preserve">PAYSPLIT - SMART BILL-SPLITTING SYSTEM</w:t>
       </w:r>
     </w:p>
     <w:p>
@@ -148,7 +148,7 @@
     <w:sdt>
       <w:sdtPr>
         <w:lock w:val="contentLocked"/>
-        <w:id w:val="2005707425"/>
+        <w:id w:val="600299625"/>
         <w:tag w:val="goog_rdk_0"/>
       </w:sdtPr>
       <w:sdtContent>
@@ -540,6 +540,24 @@
                     <w:szCs w:val="24"/>
                     <w:rtl w:val="0"/>
                   </w:rPr>
+                  <w:t xml:space="preserve">Bành Quốc Danh (VSF-FINTECH&amp;TT-PTPM)</w:t>
+                </w:r>
+              </w:p>
+              <w:p>
+                <w:pPr>
+                  <w:widowControl w:val="0"/>
+                  <w:spacing w:after="0" w:line="360" w:lineRule="auto"/>
+                  <w:rPr>
+                    <w:sz w:val="24"/>
+                    <w:szCs w:val="24"/>
+                  </w:rPr>
+                </w:pPr>
+                <w:r>
+                  <w:rPr>
+                    <w:sz w:val="24"/>
+                    <w:szCs w:val="24"/>
+                    <w:rtl w:val="0"/>
+                  </w:rPr>
                   <w:t xml:space="preserve">Phan Công Huân (VSF-FINTECH-VDTDVTC)</w:t>
                 </w:r>
               </w:p>
@@ -669,20 +687,6 @@
     </w:p>
     <w:p>
       <w:pPr>
-        <w:jc w:val="center"/>
-        <w:rPr>
-          <w:b w:val="1"/>
-          <w:bCs w:val="1"/>
-        </w:rPr>
-      </w:pPr>
-      <w:r>
-        <w:rPr>
-          <w:rtl w:val="0"/>
-        </w:rPr>
-      </w:r>
-    </w:p>
-    <w:p>
-      <w:pPr>
         <w:spacing w:before="89" w:lineRule="auto"/>
         <w:ind w:left="2526" w:right="2171" w:firstLine="0"/>
         <w:jc w:val="center"/>
@@ -726,7 +730,7 @@
     </w:p>
     <w:sdt>
       <w:sdtPr>
-        <w:id w:val="1691971061"/>
+        <w:id w:val="-1783346593"/>
         <w:docPartObj>
           <w:docPartGallery w:val="Table of Contents"/>
           <w:docPartUnique w:val="1"/>
@@ -3252,7 +3256,7 @@
     </w:p>
     <w:sdt>
       <w:sdtPr>
-        <w:id w:val="840411656"/>
+        <w:id w:val="-879718203"/>
         <w:docPartObj>
           <w:docPartGallery w:val="Table of Contents"/>
           <w:docPartUnique w:val="1"/>
@@ -3554,7 +3558,7 @@
     </w:p>
     <w:sdt>
       <w:sdtPr>
-        <w:id w:val="-1088575222"/>
+        <w:id w:val="174886596"/>
         <w:docPartObj>
           <w:docPartGallery w:val="Table of Contents"/>
           <w:docPartUnique w:val="1"/>
@@ -6274,12 +6278,12 @@
           <wp:inline distB="114300" distT="114300" distL="114300" distR="114300">
             <wp:extent cx="5305538" cy="2981624"/>
             <wp:effectExtent b="0" l="0" r="0" t="0"/>
-            <wp:docPr id="7" name="image5.png"/>
+            <wp:docPr id="7" name="image1.png"/>
             <a:graphic>
               <a:graphicData uri="http://schemas.openxmlformats.org/drawingml/2006/picture">
                 <pic:pic>
                   <pic:nvPicPr>
-                    <pic:cNvPr id="0" name="image5.png"/>
+                    <pic:cNvPr id="0" name="image1.png"/>
                     <pic:cNvPicPr preferRelativeResize="0"/>
                   </pic:nvPicPr>
                   <pic:blipFill>
@@ -6722,12 +6726,12 @@
           <wp:inline distB="114300" distT="114300" distL="114300" distR="114300">
             <wp:extent cx="5943165" cy="3516782"/>
             <wp:effectExtent b="0" l="0" r="0" t="0"/>
-            <wp:docPr id="9" name="image4.png"/>
+            <wp:docPr id="9" name="image3.png"/>
             <a:graphic>
               <a:graphicData uri="http://schemas.openxmlformats.org/drawingml/2006/picture">
                 <pic:pic>
                   <pic:nvPicPr>
-                    <pic:cNvPr id="0" name="image4.png"/>
+                    <pic:cNvPr id="0" name="image3.png"/>
                     <pic:cNvPicPr preferRelativeResize="0"/>
                   </pic:nvPicPr>
                   <pic:blipFill>
@@ -8246,12 +8250,12 @@
           <wp:inline distB="114300" distT="114300" distL="114300" distR="114300">
             <wp:extent cx="5136803" cy="5264162"/>
             <wp:effectExtent b="0" l="0" r="0" t="0"/>
-            <wp:docPr id="11" name="image3.png"/>
+            <wp:docPr id="11" name="image5.png"/>
             <a:graphic>
               <a:graphicData uri="http://schemas.openxmlformats.org/drawingml/2006/picture">
                 <pic:pic>
                   <pic:nvPicPr>
-                    <pic:cNvPr id="0" name="image3.png"/>
+                    <pic:cNvPr id="0" name="image5.png"/>
                     <pic:cNvPicPr preferRelativeResize="0"/>
                   </pic:nvPicPr>
                   <pic:blipFill>
@@ -8308,12 +8312,12 @@
           <wp:inline distB="114300" distT="114300" distL="114300" distR="114300">
             <wp:extent cx="3049005" cy="2589309"/>
             <wp:effectExtent b="0" l="0" r="0" t="0"/>
-            <wp:docPr id="10" name="image2.png"/>
+            <wp:docPr id="10" name="image4.png"/>
             <a:graphic>
               <a:graphicData uri="http://schemas.openxmlformats.org/drawingml/2006/picture">
                 <pic:pic>
                   <pic:nvPicPr>
-                    <pic:cNvPr id="0" name="image2.png"/>
+                    <pic:cNvPr id="0" name="image4.png"/>
                     <pic:cNvPicPr preferRelativeResize="0"/>
                   </pic:nvPicPr>
                   <pic:blipFill>
@@ -22499,7 +22503,7 @@
     <w:sdt>
       <w:sdtPr>
         <w:lock w:val="contentLocked"/>
-        <w:id w:val="-533030381"/>
+        <w:id w:val="1278034709"/>
         <w:tag w:val="goog_rdk_1"/>
       </w:sdtPr>
       <w:sdtContent>
@@ -23113,7 +23117,7 @@
     <w:sdt>
       <w:sdtPr>
         <w:lock w:val="contentLocked"/>
-        <w:id w:val="-1742219255"/>
+        <w:id w:val="650494672"/>
         <w:tag w:val="goog_rdk_2"/>
       </w:sdtPr>
       <w:sdtContent>

</xml_diff>

<commit_message>
Update Report1_Product_Requirement_Document with latest revisions
</commit_message>
<xml_diff>
--- a/Report1_Product_Requirement_Document.docx
+++ b/Report1_Product_Requirement_Document.docx
@@ -14,12 +14,12 @@
           <wp:inline distB="114300" distT="114300" distL="114300" distR="114300">
             <wp:extent cx="2733675" cy="1148612"/>
             <wp:effectExtent b="0" l="0" r="0" t="0"/>
-            <wp:docPr id="8" name="image2.png"/>
+            <wp:docPr id="8" name="image4.png"/>
             <a:graphic>
               <a:graphicData uri="http://schemas.openxmlformats.org/drawingml/2006/picture">
                 <pic:pic>
                   <pic:nvPicPr>
-                    <pic:cNvPr id="0" name="image2.png"/>
+                    <pic:cNvPr id="0" name="image4.png"/>
                     <pic:cNvPicPr preferRelativeResize="0"/>
                   </pic:nvPicPr>
                   <pic:blipFill>
@@ -148,7 +148,7 @@
     <w:sdt>
       <w:sdtPr>
         <w:lock w:val="contentLocked"/>
-        <w:id w:val="600299625"/>
+        <w:id w:val="269641364"/>
         <w:tag w:val="goog_rdk_0"/>
       </w:sdtPr>
       <w:sdtContent>
@@ -730,7 +730,7 @@
     </w:p>
     <w:sdt>
       <w:sdtPr>
-        <w:id w:val="-1783346593"/>
+        <w:id w:val="1875544232"/>
         <w:docPartObj>
           <w:docPartGallery w:val="Table of Contents"/>
           <w:docPartUnique w:val="1"/>
@@ -3256,7 +3256,7 @@
     </w:p>
     <w:sdt>
       <w:sdtPr>
-        <w:id w:val="-879718203"/>
+        <w:id w:val="-2112336103"/>
         <w:docPartObj>
           <w:docPartGallery w:val="Table of Contents"/>
           <w:docPartUnique w:val="1"/>
@@ -3558,7 +3558,7 @@
     </w:p>
     <w:sdt>
       <w:sdtPr>
-        <w:id w:val="174886596"/>
+        <w:id w:val="2003466682"/>
         <w:docPartObj>
           <w:docPartGallery w:val="Table of Contents"/>
           <w:docPartUnique w:val="1"/>
@@ -5601,12 +5601,12 @@
           <wp:inline distB="114300" distT="114300" distL="114300" distR="114300">
             <wp:extent cx="5781788" cy="3835814"/>
             <wp:effectExtent b="0" l="0" r="0" t="0"/>
-            <wp:docPr id="12" name="image6.png"/>
+            <wp:docPr id="12" name="image5.png"/>
             <a:graphic>
               <a:graphicData uri="http://schemas.openxmlformats.org/drawingml/2006/picture">
                 <pic:pic>
                   <pic:nvPicPr>
-                    <pic:cNvPr id="0" name="image6.png"/>
+                    <pic:cNvPr id="0" name="image5.png"/>
                     <pic:cNvPicPr preferRelativeResize="0"/>
                   </pic:nvPicPr>
                   <pic:blipFill>
@@ -6278,12 +6278,12 @@
           <wp:inline distB="114300" distT="114300" distL="114300" distR="114300">
             <wp:extent cx="5305538" cy="2981624"/>
             <wp:effectExtent b="0" l="0" r="0" t="0"/>
-            <wp:docPr id="7" name="image1.png"/>
+            <wp:docPr id="7" name="image6.png"/>
             <a:graphic>
               <a:graphicData uri="http://schemas.openxmlformats.org/drawingml/2006/picture">
                 <pic:pic>
                   <pic:nvPicPr>
-                    <pic:cNvPr id="0" name="image1.png"/>
+                    <pic:cNvPr id="0" name="image6.png"/>
                     <pic:cNvPicPr preferRelativeResize="0"/>
                   </pic:nvPicPr>
                   <pic:blipFill>
@@ -6726,12 +6726,12 @@
           <wp:inline distB="114300" distT="114300" distL="114300" distR="114300">
             <wp:extent cx="5943165" cy="3516782"/>
             <wp:effectExtent b="0" l="0" r="0" t="0"/>
-            <wp:docPr id="9" name="image3.png"/>
+            <wp:docPr id="9" name="image1.png"/>
             <a:graphic>
               <a:graphicData uri="http://schemas.openxmlformats.org/drawingml/2006/picture">
                 <pic:pic>
                   <pic:nvPicPr>
-                    <pic:cNvPr id="0" name="image3.png"/>
+                    <pic:cNvPr id="0" name="image1.png"/>
                     <pic:cNvPicPr preferRelativeResize="0"/>
                   </pic:nvPicPr>
                   <pic:blipFill>
@@ -7544,10 +7544,14 @@
                 <w:rFonts w:ascii="Calibri" w:cs="Calibri" w:eastAsia="Calibri" w:hAnsi="Calibri"/>
                 <w:sz w:val="22"/>
                 <w:szCs w:val="22"/>
-                <w:highlight w:val="white"/>
-                <w:rtl w:val="0"/>
-              </w:rPr>
-              <w:t xml:space="preserve">The system operator is tasked with monitoring model performance, retraining models when necessary, and updating rule configurations. They expect a clear pipeline, a model card, and comprehensive system logs.</w:t>
+                <w:rtl w:val="0"/>
+              </w:rPr>
+              <w:t xml:space="preserve">The group administrator responsible for managing members, collaborating on expense allocation, and finalizing bills. They expect full control over group data and fast, automated calculations to ensure fair splitting.</w:t>
+            </w:r>
+            <w:r>
+              <w:rPr>
+                <w:rtl w:val="0"/>
+              </w:rPr>
             </w:r>
           </w:p>
         </w:tc>
@@ -8250,12 +8254,12 @@
           <wp:inline distB="114300" distT="114300" distL="114300" distR="114300">
             <wp:extent cx="5136803" cy="5264162"/>
             <wp:effectExtent b="0" l="0" r="0" t="0"/>
-            <wp:docPr id="11" name="image5.png"/>
+            <wp:docPr id="11" name="image2.png"/>
             <a:graphic>
               <a:graphicData uri="http://schemas.openxmlformats.org/drawingml/2006/picture">
                 <pic:pic>
                   <pic:nvPicPr>
-                    <pic:cNvPr id="0" name="image5.png"/>
+                    <pic:cNvPr id="0" name="image2.png"/>
                     <pic:cNvPicPr preferRelativeResize="0"/>
                   </pic:nvPicPr>
                   <pic:blipFill>
@@ -8312,12 +8316,12 @@
           <wp:inline distB="114300" distT="114300" distL="114300" distR="114300">
             <wp:extent cx="3049005" cy="2589309"/>
             <wp:effectExtent b="0" l="0" r="0" t="0"/>
-            <wp:docPr id="10" name="image4.png"/>
+            <wp:docPr id="10" name="image3.png"/>
             <a:graphic>
               <a:graphicData uri="http://schemas.openxmlformats.org/drawingml/2006/picture">
                 <pic:pic>
                   <pic:nvPicPr>
-                    <pic:cNvPr id="0" name="image4.png"/>
+                    <pic:cNvPr id="0" name="image3.png"/>
                     <pic:cNvPicPr preferRelativeResize="0"/>
                   </pic:nvPicPr>
                   <pic:blipFill>
@@ -10198,7 +10202,7 @@
               <w:rPr>
                 <w:rtl w:val="0"/>
               </w:rPr>
-              <w:t xml:space="preserve">Creditor</w:t>
+              <w:t xml:space="preserve">Captain, Creditor</w:t>
             </w:r>
           </w:p>
         </w:tc>
@@ -10454,7 +10458,7 @@
               <w:rPr>
                 <w:rtl w:val="0"/>
               </w:rPr>
-              <w:t xml:space="preserve">Captain, Creditor</w:t>
+              <w:t xml:space="preserve">Captain</w:t>
             </w:r>
           </w:p>
         </w:tc>
@@ -10612,7 +10616,7 @@
               <w:rPr>
                 <w:rtl w:val="0"/>
               </w:rPr>
-              <w:t xml:space="preserve">- Displays the amount the Payer owes, the breakdown of the items charged to them, the rounding adjustment applied, the recipient of the payment, and the reference code attached to their payment request.</w:t>
+              <w:t xml:space="preserve">- Displays the amount the Payer owes, the breakdown of the items charged to them, the Srounding adjustment applied, the recipient of the payment, and the reference code attached to their payment request.</w:t>
             </w:r>
           </w:p>
         </w:tc>
@@ -11508,7 +11512,21 @@
               <w:rPr>
                 <w:rtl w:val="0"/>
               </w:rPr>
-              <w:t xml:space="preserve">- Monitors system health, API performance, and background tasks (OCR, webhooks) via endpoints and the admin dashboard.</w:t>
+              <w:t xml:space="preserve">- Monitors system health, API performance, and background tasks (OCR, </w:t>
+            </w:r>
+            <w:r>
+              <w:rPr>
+                <w:b w:val="1"/>
+                <w:bCs w:val="1"/>
+                <w:rtl w:val="0"/>
+              </w:rPr>
+              <w:t xml:space="preserve">queues</w:t>
+            </w:r>
+            <w:r>
+              <w:rPr>
+                <w:rtl w:val="0"/>
+              </w:rPr>
+              <w:t xml:space="preserve">) via endpoints and the admin dashboard.</w:t>
             </w:r>
           </w:p>
         </w:tc>
@@ -16082,7 +16100,7 @@
         <w:rPr>
           <w:rtl w:val="0"/>
         </w:rPr>
-        <w:t xml:space="preserve">The Creditor allocates items on the bill review screen.</w:t>
+        <w:t xml:space="preserve">The Captain or the Creditor allocates items on the bill review screen.</w:t>
       </w:r>
       <w:r>
         <w:rPr>
@@ -16121,7 +16139,7 @@
         <w:rPr>
           <w:rtl w:val="0"/>
         </w:rPr>
-        <w:t xml:space="preserve">Determines the share of the bill attributable to each participant, either per item or by an equal split across selected members.</w:t>
+        <w:t xml:space="preserve">Determines the share of the bill attributable to each participant, either per item or by an equal split across selected members. The Captain can assign items for any bill within their group, whereas a Creditor can assign items for bills they have personally uploaded.</w:t>
       </w:r>
     </w:p>
     <w:p>
@@ -16170,7 +16188,7 @@
         <w:rPr>
           <w:rtl w:val="0"/>
         </w:rPr>
-        <w:t xml:space="preserve">: Every assignee must be an active member of the group or a declared anonymous participant; each item must be assigned to at least one participant before the bill can be finalized; assignment weights must be positive.</w:t>
+        <w:t xml:space="preserve">: Every assignee must be an active member of the group. Each item must be assigned to at least one participant before the bill can be finalized. Assignment weights must be positive.</w:t>
       </w:r>
     </w:p>
     <w:p>
@@ -16238,7 +16256,7 @@
         <w:rPr>
           <w:rtl w:val="0"/>
         </w:rPr>
-        <w:t xml:space="preserve">The Creditor selects an item and chooses the participants who consumed it, optionally with different weights or quantities.</w:t>
+        <w:t xml:space="preserve">The Captain or the Creditor selects an item and chooses the participants who consumed it, optionally with different weights or quantities.</w:t>
       </w:r>
     </w:p>
     <w:p>
@@ -16257,7 +16275,7 @@
         <w:rPr>
           <w:rtl w:val="0"/>
         </w:rPr>
-        <w:t xml:space="preserve">Alternatively, the Creditor applies an "equal split" rule that distributes the whole bill evenly across the selected participants.</w:t>
+        <w:t xml:space="preserve">Alternatively, the acting user applies an "equal split" rule that distributes the whole bill evenly across the selected participants.</w:t>
       </w:r>
     </w:p>
     <w:p>
@@ -16304,7 +16322,7 @@
           <w:ilvl w:val="2"/>
           <w:numId w:val="1"/>
         </w:numPr>
-        <w:spacing w:after="0" w:afterAutospacing="0" w:line="276" w:lineRule="auto"/>
+        <w:spacing w:after="0" w:line="276" w:lineRule="auto"/>
         <w:ind w:left="1559.0551181102362" w:hanging="360.0000000000003"/>
       </w:pPr>
       <w:r>
@@ -16322,7 +16340,7 @@
           <w:ilvl w:val="3"/>
           <w:numId w:val="1"/>
         </w:numPr>
-        <w:spacing w:after="0" w:afterAutospacing="0" w:before="0" w:beforeAutospacing="0" w:line="276" w:lineRule="auto"/>
+        <w:spacing w:after="0" w:line="276" w:lineRule="auto"/>
         <w:ind w:left="1984.251968503937" w:hanging="360"/>
         <w:rPr>
           <w:rFonts w:ascii="Noto Sans Symbols" w:cs="Noto Sans Symbols" w:eastAsia="Noto Sans Symbols" w:hAnsi="Noto Sans Symbols"/>
@@ -16334,13 +16352,13 @@
           <w:iCs w:val="1"/>
           <w:rtl w:val="0"/>
         </w:rPr>
-        <w:t xml:space="preserve">Unassigned items remain:</w:t>
-      </w:r>
-      <w:r>
-        <w:rPr>
-          <w:rtl w:val="0"/>
-        </w:rPr>
-        <w:t xml:space="preserve"> The system blocks finalization and highlights the items still requiring an assignee.</w:t>
+        <w:t xml:space="preserve">Unassigned items remain: </w:t>
+      </w:r>
+      <w:r>
+        <w:rPr>
+          <w:rtl w:val="0"/>
+        </w:rPr>
+        <w:t xml:space="preserve">The system blocks finalization and highlights the items still requiring an assignee.</w:t>
       </w:r>
     </w:p>
     <w:p>
@@ -16349,7 +16367,7 @@
           <w:ilvl w:val="3"/>
           <w:numId w:val="1"/>
         </w:numPr>
-        <w:spacing w:after="0" w:afterAutospacing="0" w:before="0" w:beforeAutospacing="0" w:line="276" w:lineRule="auto"/>
+        <w:spacing w:after="0" w:line="276" w:lineRule="auto"/>
         <w:ind w:left="1984.251968503937" w:hanging="360"/>
         <w:rPr>
           <w:rFonts w:ascii="Noto Sans Symbols" w:cs="Noto Sans Symbols" w:eastAsia="Noto Sans Symbols" w:hAnsi="Noto Sans Symbols"/>
@@ -16361,45 +16379,13 @@
           <w:iCs w:val="1"/>
           <w:rtl w:val="0"/>
         </w:rPr>
-        <w:t xml:space="preserve">Assignment to a member who has left the group:</w:t>
-      </w:r>
-      <w:r>
-        <w:rPr>
-          <w:rtl w:val="0"/>
-        </w:rPr>
-        <w:t xml:space="preserve"> Return HTTP 409 and prompt the Creditor to reassign the item.</w:t>
-      </w:r>
-    </w:p>
-    <w:p>
-      <w:pPr>
-        <w:numPr>
-          <w:ilvl w:val="3"/>
-          <w:numId w:val="1"/>
-        </w:numPr>
-        <w:spacing w:after="0" w:before="0" w:line="276" w:lineRule="auto"/>
-        <w:ind w:left="1984.251968503937" w:hanging="360"/>
-        <w:rPr>
-          <w:rFonts w:ascii="Noto Sans Symbols" w:cs="Noto Sans Symbols" w:eastAsia="Noto Sans Symbols" w:hAnsi="Noto Sans Symbols"/>
-        </w:rPr>
-      </w:pPr>
-      <w:r>
-        <w:rPr>
-          <w:i w:val="1"/>
-          <w:iCs w:val="1"/>
-          <w:rtl w:val="0"/>
-        </w:rPr>
-        <w:t xml:space="preserve">Anonymous participant:</w:t>
-      </w:r>
-      <w:r>
-        <w:rPr>
-          <w:rtl w:val="0"/>
-        </w:rPr>
-        <w:t xml:space="preserve"> The system permits the assignment for calculation purposes but records that no ledger entry can be created for a participant without an identity; the corresponding amount is attributed to the Creditor.</w:t>
-      </w:r>
-      <w:r>
-        <w:rPr>
-          <w:rtl w:val="0"/>
-        </w:rPr>
+        <w:t xml:space="preserve">Assignment to a member who has left the group: </w:t>
+      </w:r>
+      <w:r>
+        <w:rPr>
+          <w:rtl w:val="0"/>
+        </w:rPr>
+        <w:t xml:space="preserve">Return HTTP 409 and prompt the user to reassign the item.</w:t>
       </w:r>
     </w:p>
     <w:p>
@@ -16816,7 +16802,7 @@
         <w:rPr>
           <w:rtl w:val="0"/>
         </w:rPr>
-        <w:t xml:space="preserve">The Captain or the Creditor confirms the bill on the review screen.</w:t>
+        <w:t xml:space="preserve">The Captain confirms the finalization action via the review screen.</w:t>
       </w:r>
       <w:r>
         <w:rPr>
@@ -16855,7 +16841,7 @@
         <w:rPr>
           <w:rtl w:val="0"/>
         </w:rPr>
-        <w:t xml:space="preserve">Locks the bill, computes the definitive per-person amounts, records them in the ledger, simplifies the resulting debts, and issues an individual payment QR code for each debtor.</w:t>
+        <w:t xml:space="preserve">Executed exclusively by the Captain. This action locks the bill immutably, computes the definitive per-person amounts, records them in the ledger, simplifies the resulting debts, and issues an individual payment QR code for each debtor.</w:t>
       </w:r>
     </w:p>
     <w:p>
@@ -16918,7 +16904,7 @@
         <w:rPr>
           <w:rtl w:val="0"/>
         </w:rPr>
-        <w:t xml:space="preserve"> status with all items assigned; the participant list must contain at least two participants; the Creditor must have valid receiving bank account information configured.</w:t>
+        <w:t xml:space="preserve"> status with all items assigned. The respective Creditors must have valid receiving bank account information configured.</w:t>
       </w:r>
     </w:p>
     <w:p>
@@ -16986,7 +16972,7 @@
         <w:rPr>
           <w:rtl w:val="0"/>
         </w:rPr>
-        <w:t xml:space="preserve">The system takes an immutable snapshot of the participant list at the moment of finalization.</w:t>
+        <w:t xml:space="preserve">The system takes an immutable snapshot of the participant list at the moment of execution.</w:t>
       </w:r>
     </w:p>
     <w:p>
@@ -17005,7 +16991,102 @@
         <w:rPr>
           <w:rtl w:val="0"/>
         </w:rPr>
-        <w:t xml:space="preserve">The Split Engine computes each participant's share using </w:t>
+        <w:t xml:space="preserve">The system globally locks the bill to prevent any further modifications.</w:t>
+      </w:r>
+    </w:p>
+    <w:p>
+      <w:pPr>
+        <w:numPr>
+          <w:ilvl w:val="3"/>
+          <w:numId w:val="1"/>
+        </w:numPr>
+        <w:spacing w:after="0" w:afterAutospacing="0" w:before="0" w:beforeAutospacing="0" w:line="276" w:lineRule="auto"/>
+        <w:ind w:left="1984.251968503937" w:hanging="360"/>
+        <w:rPr>
+          <w:rFonts w:ascii="Noto Sans Symbols" w:cs="Noto Sans Symbols" w:eastAsia="Noto Sans Symbols" w:hAnsi="Noto Sans Symbols"/>
+        </w:rPr>
+      </w:pPr>
+      <w:r>
+        <w:rPr>
+          <w:rtl w:val="0"/>
+        </w:rPr>
+        <w:t xml:space="preserve">The Split Controller computes each participant's share using int64 arithmetic and distributes rounding remainders through the largest-remainder (Hamilton) method, guaranteeing that the sum of all shares equals the bill total exactly.</w:t>
+      </w:r>
+    </w:p>
+    <w:p>
+      <w:pPr>
+        <w:numPr>
+          <w:ilvl w:val="3"/>
+          <w:numId w:val="1"/>
+        </w:numPr>
+        <w:spacing w:after="0" w:afterAutospacing="0" w:before="0" w:beforeAutospacing="0" w:line="276" w:lineRule="auto"/>
+        <w:ind w:left="1984.251968503937" w:hanging="360"/>
+        <w:rPr>
+          <w:rFonts w:ascii="Noto Sans Symbols" w:cs="Noto Sans Symbols" w:eastAsia="Noto Sans Symbols" w:hAnsi="Noto Sans Symbols"/>
+        </w:rPr>
+      </w:pPr>
+      <w:r>
+        <w:rPr>
+          <w:rtl w:val="0"/>
+        </w:rPr>
+        <w:t xml:space="preserve">The system writes balanced double-entry ledger entries so that the sum of all member balances within the group remains zero.</w:t>
+      </w:r>
+    </w:p>
+    <w:p>
+      <w:pPr>
+        <w:numPr>
+          <w:ilvl w:val="3"/>
+          <w:numId w:val="1"/>
+        </w:numPr>
+        <w:spacing w:after="0" w:afterAutospacing="0" w:before="0" w:beforeAutospacing="0" w:line="276" w:lineRule="auto"/>
+        <w:ind w:left="1984.251968503937" w:hanging="360"/>
+        <w:rPr>
+          <w:rFonts w:ascii="Noto Sans Symbols" w:cs="Noto Sans Symbols" w:eastAsia="Noto Sans Symbols" w:hAnsi="Noto Sans Symbols"/>
+        </w:rPr>
+      </w:pPr>
+      <w:r>
+        <w:rPr>
+          <w:rtl w:val="0"/>
+        </w:rPr>
+        <w:t xml:space="preserve">The Settlement Controller computes a simplified set of transfers that minimizes the number of transactions required to clear the outstanding balances.</w:t>
+      </w:r>
+    </w:p>
+    <w:p>
+      <w:pPr>
+        <w:numPr>
+          <w:ilvl w:val="3"/>
+          <w:numId w:val="1"/>
+        </w:numPr>
+        <w:spacing w:after="0" w:afterAutospacing="0" w:before="0" w:beforeAutospacing="0" w:line="276" w:lineRule="auto"/>
+        <w:ind w:left="1984.251968503937" w:hanging="360"/>
+        <w:rPr>
+          <w:rFonts w:ascii="Noto Sans Symbols" w:cs="Noto Sans Symbols" w:eastAsia="Noto Sans Symbols" w:hAnsi="Noto Sans Symbols"/>
+        </w:rPr>
+      </w:pPr>
+      <w:r>
+        <w:rPr>
+          <w:rtl w:val="0"/>
+        </w:rPr>
+        <w:t xml:space="preserve">For each resulting transfer, the system generates a VietQR payload encoding the recipient account, the exact amount, and a unique reference code for manual cross-checking.</w:t>
+      </w:r>
+    </w:p>
+    <w:p>
+      <w:pPr>
+        <w:numPr>
+          <w:ilvl w:val="3"/>
+          <w:numId w:val="1"/>
+        </w:numPr>
+        <w:spacing w:after="0" w:afterAutospacing="0" w:before="0" w:beforeAutospacing="0" w:line="276" w:lineRule="auto"/>
+        <w:ind w:left="1984.251968503937" w:hanging="360"/>
+        <w:rPr>
+          <w:rFonts w:ascii="Noto Sans Symbols" w:cs="Noto Sans Symbols" w:eastAsia="Noto Sans Symbols" w:hAnsi="Noto Sans Symbols"/>
+        </w:rPr>
+      </w:pPr>
+      <w:r>
+        <w:rPr>
+          <w:rtl w:val="0"/>
+        </w:rPr>
+        <w:t xml:space="preserve">The system transitions the bill to </w:t>
       </w:r>
       <w:r>
         <w:rPr>
@@ -17013,13 +17094,31 @@
           <w:color w:val="188038"/>
           <w:rtl w:val="0"/>
         </w:rPr>
-        <w:t xml:space="preserve">int64</w:t>
-      </w:r>
-      <w:r>
-        <w:rPr>
-          <w:rtl w:val="0"/>
-        </w:rPr>
-        <w:t xml:space="preserve"> arithmetic and distributes rounding remainders through the largest-remainder (Hamilton) method, guaranteeing that the sum of all shares equals the bill total exactly.</w:t>
+        <w:t xml:space="preserve">FINALIZED</w:t>
+      </w:r>
+      <w:r>
+        <w:rPr>
+          <w:rtl w:val="0"/>
+        </w:rPr>
+        <w:t xml:space="preserve">, notifies all participants through push notifications, and displays the rounding adjustment applied to each person for transparency.</w:t>
+      </w:r>
+    </w:p>
+    <w:p>
+      <w:pPr>
+        <w:numPr>
+          <w:ilvl w:val="2"/>
+          <w:numId w:val="1"/>
+        </w:numPr>
+        <w:spacing w:after="0" w:afterAutospacing="0" w:line="276" w:lineRule="auto"/>
+        <w:ind w:left="1559.0551181102362" w:hanging="360.0000000000003"/>
+      </w:pPr>
+      <w:r>
+        <w:rPr>
+          <w:i w:val="1"/>
+          <w:iCs w:val="1"/>
+          <w:rtl w:val="0"/>
+        </w:rPr>
+        <w:t xml:space="preserve">In Abnormal Cases:</w:t>
       </w:r>
     </w:p>
     <w:p>
@@ -17036,9 +17135,17 @@
       </w:pPr>
       <w:r>
         <w:rPr>
-          <w:rtl w:val="0"/>
-        </w:rPr>
-        <w:t xml:space="preserve">The system writes balanced double-entry ledger entries so that the sum of all member balances within the group remains zero.</w:t>
+          <w:i w:val="1"/>
+          <w:iCs w:val="1"/>
+          <w:rtl w:val="0"/>
+        </w:rPr>
+        <w:t xml:space="preserve">Creditor has no valid bank account:</w:t>
+      </w:r>
+      <w:r>
+        <w:rPr>
+          <w:rtl w:val="0"/>
+        </w:rPr>
+        <w:t xml:space="preserve"> Return HTTP 409 and prompt the Admin to require the Creditor to complete their banking details before finalizing.</w:t>
       </w:r>
     </w:p>
     <w:p>
@@ -17055,9 +17162,17 @@
       </w:pPr>
       <w:r>
         <w:rPr>
-          <w:rtl w:val="0"/>
-        </w:rPr>
-        <w:t xml:space="preserve">The Settlement Engine computes a simplified set of transfers that minimizes the number of transactions required to clear the outstanding balances.</w:t>
+          <w:i w:val="1"/>
+          <w:iCs w:val="1"/>
+          <w:rtl w:val="0"/>
+        </w:rPr>
+        <w:t xml:space="preserve">Unassigned items or an empty participant list:</w:t>
+      </w:r>
+      <w:r>
+        <w:rPr>
+          <w:rtl w:val="0"/>
+        </w:rPr>
+        <w:t xml:space="preserve"> Return HTTP 400 identifying the specific blocking condition.</w:t>
       </w:r>
     </w:p>
     <w:p>
@@ -17074,28 +17189,17 @@
       </w:pPr>
       <w:r>
         <w:rPr>
-          <w:rtl w:val="0"/>
-        </w:rPr>
-        <w:t xml:space="preserve">For each resulting transfer, the system generates a VietQR payload encoding the recipient account, the exact amount, and a unique reference code used for webhook reconciliation.</w:t>
-      </w:r>
-    </w:p>
-    <w:p>
-      <w:pPr>
-        <w:numPr>
-          <w:ilvl w:val="3"/>
-          <w:numId w:val="1"/>
-        </w:numPr>
-        <w:spacing w:after="0" w:afterAutospacing="0" w:before="0" w:beforeAutospacing="0" w:line="276" w:lineRule="auto"/>
-        <w:ind w:left="1984.251968503937" w:hanging="360"/>
-        <w:rPr>
-          <w:rFonts w:ascii="Noto Sans Symbols" w:cs="Noto Sans Symbols" w:eastAsia="Noto Sans Symbols" w:hAnsi="Noto Sans Symbols"/>
-        </w:rPr>
-      </w:pPr>
-      <w:r>
-        <w:rPr>
-          <w:rtl w:val="0"/>
-        </w:rPr>
-        <w:t xml:space="preserve">The system transitions the bill to </w:t>
+          <w:i w:val="1"/>
+          <w:iCs w:val="1"/>
+          <w:rtl w:val="0"/>
+        </w:rPr>
+        <w:t xml:space="preserve">Ledger transaction failure: </w:t>
+      </w:r>
+      <w:r>
+        <w:rPr>
+          <w:rtl w:val="0"/>
+        </w:rPr>
+        <w:t xml:space="preserve">The entire finalization is rolled back within a single database transaction, leaving the bills in </w:t>
       </w:r>
       <w:r>
         <w:rPr>
@@ -17103,31 +17207,13 @@
           <w:color w:val="188038"/>
           <w:rtl w:val="0"/>
         </w:rPr>
-        <w:t xml:space="preserve">FINALIZED</w:t>
-      </w:r>
-      <w:r>
-        <w:rPr>
-          <w:rtl w:val="0"/>
-        </w:rPr>
-        <w:t xml:space="preserve">, notifies all participants through push notification, and displays the rounding adjustment applied to each person for transparency.</w:t>
-      </w:r>
-    </w:p>
-    <w:p>
-      <w:pPr>
-        <w:numPr>
-          <w:ilvl w:val="2"/>
-          <w:numId w:val="1"/>
-        </w:numPr>
-        <w:spacing w:after="0" w:afterAutospacing="0" w:line="276" w:lineRule="auto"/>
-        <w:ind w:left="1559.0551181102362" w:hanging="360.0000000000003"/>
-      </w:pPr>
-      <w:r>
-        <w:rPr>
-          <w:i w:val="1"/>
-          <w:iCs w:val="1"/>
-          <w:rtl w:val="0"/>
-        </w:rPr>
-        <w:t xml:space="preserve">In Abnormal Cases:</w:t>
+        <w:t xml:space="preserve">DRAFT</w:t>
+      </w:r>
+      <w:r>
+        <w:rPr>
+          <w:rtl w:val="0"/>
+        </w:rPr>
+        <w:t xml:space="preserve"> status; no partial ledger entries are ever persisted.</w:t>
       </w:r>
     </w:p>
     <w:p>
@@ -17136,7 +17222,7 @@
           <w:ilvl w:val="3"/>
           <w:numId w:val="1"/>
         </w:numPr>
-        <w:spacing w:after="0" w:afterAutospacing="0" w:before="0" w:beforeAutospacing="0" w:line="276" w:lineRule="auto"/>
+        <w:spacing w:after="240" w:before="0" w:beforeAutospacing="0" w:line="276" w:lineRule="auto"/>
         <w:ind w:left="1984.251968503937" w:hanging="360"/>
         <w:rPr>
           <w:rFonts w:ascii="Noto Sans Symbols" w:cs="Noto Sans Symbols" w:eastAsia="Noto Sans Symbols" w:hAnsi="Noto Sans Symbols"/>
@@ -17148,101 +17234,6 @@
           <w:iCs w:val="1"/>
           <w:rtl w:val="0"/>
         </w:rPr>
-        <w:t xml:space="preserve">Creditor has no valid bank account:</w:t>
-      </w:r>
-      <w:r>
-        <w:rPr>
-          <w:rtl w:val="0"/>
-        </w:rPr>
-        <w:t xml:space="preserve"> Return HTTP 409 and direct the Creditor to complete their banking details before finalizing.</w:t>
-      </w:r>
-    </w:p>
-    <w:p>
-      <w:pPr>
-        <w:numPr>
-          <w:ilvl w:val="3"/>
-          <w:numId w:val="1"/>
-        </w:numPr>
-        <w:spacing w:after="0" w:afterAutospacing="0" w:before="0" w:beforeAutospacing="0" w:line="276" w:lineRule="auto"/>
-        <w:ind w:left="1984.251968503937" w:hanging="360"/>
-        <w:rPr>
-          <w:rFonts w:ascii="Noto Sans Symbols" w:cs="Noto Sans Symbols" w:eastAsia="Noto Sans Symbols" w:hAnsi="Noto Sans Symbols"/>
-        </w:rPr>
-      </w:pPr>
-      <w:r>
-        <w:rPr>
-          <w:i w:val="1"/>
-          <w:iCs w:val="1"/>
-          <w:rtl w:val="0"/>
-        </w:rPr>
-        <w:t xml:space="preserve">Unassigned items or an empty participant list:</w:t>
-      </w:r>
-      <w:r>
-        <w:rPr>
-          <w:rtl w:val="0"/>
-        </w:rPr>
-        <w:t xml:space="preserve"> Return HTTP 400 identifying the specific blocking condition.</w:t>
-      </w:r>
-    </w:p>
-    <w:p>
-      <w:pPr>
-        <w:numPr>
-          <w:ilvl w:val="3"/>
-          <w:numId w:val="1"/>
-        </w:numPr>
-        <w:spacing w:after="0" w:afterAutospacing="0" w:before="0" w:beforeAutospacing="0" w:line="276" w:lineRule="auto"/>
-        <w:ind w:left="1984.251968503937" w:hanging="360"/>
-        <w:rPr>
-          <w:rFonts w:ascii="Noto Sans Symbols" w:cs="Noto Sans Symbols" w:eastAsia="Noto Sans Symbols" w:hAnsi="Noto Sans Symbols"/>
-        </w:rPr>
-      </w:pPr>
-      <w:r>
-        <w:rPr>
-          <w:i w:val="1"/>
-          <w:iCs w:val="1"/>
-          <w:rtl w:val="0"/>
-        </w:rPr>
-        <w:t xml:space="preserve">Ledger transaction failure:</w:t>
-      </w:r>
-      <w:r>
-        <w:rPr>
-          <w:rtl w:val="0"/>
-        </w:rPr>
-        <w:t xml:space="preserve"> The entire finalization is rolled back within a single database transaction, leaving the bill in </w:t>
-      </w:r>
-      <w:r>
-        <w:rPr>
-          <w:rFonts w:ascii="Roboto Mono" w:cs="Roboto Mono" w:eastAsia="Roboto Mono" w:hAnsi="Roboto Mono"/>
-          <w:color w:val="188038"/>
-          <w:rtl w:val="0"/>
-        </w:rPr>
-        <w:t xml:space="preserve">DRAFT</w:t>
-      </w:r>
-      <w:r>
-        <w:rPr>
-          <w:rtl w:val="0"/>
-        </w:rPr>
-        <w:t xml:space="preserve"> status; no partial ledger entries are ever persisted.</w:t>
-      </w:r>
-    </w:p>
-    <w:p>
-      <w:pPr>
-        <w:numPr>
-          <w:ilvl w:val="3"/>
-          <w:numId w:val="1"/>
-        </w:numPr>
-        <w:spacing w:after="0" w:before="0" w:line="276" w:lineRule="auto"/>
-        <w:ind w:left="1984.251968503937" w:hanging="360"/>
-        <w:rPr>
-          <w:rFonts w:ascii="Noto Sans Symbols" w:cs="Noto Sans Symbols" w:eastAsia="Noto Sans Symbols" w:hAnsi="Noto Sans Symbols"/>
-        </w:rPr>
-      </w:pPr>
-      <w:r>
-        <w:rPr>
-          <w:i w:val="1"/>
-          <w:iCs w:val="1"/>
-          <w:rtl w:val="0"/>
-        </w:rPr>
         <w:t xml:space="preserve">QR generation failure for one recipient:</w:t>
       </w:r>
       <w:r>
@@ -17250,11 +17241,6 @@
           <w:rtl w:val="0"/>
         </w:rPr>
         <w:t xml:space="preserve"> Finalization still completes, and the affected debt is shown with the recipient's bank details in plain form so that a manual transfer remains possible.</w:t>
-      </w:r>
-      <w:r>
-        <w:rPr>
-          <w:rtl w:val="0"/>
-        </w:rPr>
       </w:r>
     </w:p>
     <w:p>
@@ -17835,6 +17821,24 @@
     <w:p>
       <w:pPr>
         <w:numPr>
+          <w:ilvl w:val="2"/>
+          <w:numId w:val="1"/>
+        </w:numPr>
+        <w:spacing w:after="0" w:afterAutospacing="0" w:line="276" w:lineRule="auto"/>
+        <w:ind w:left="1559.0551181102362" w:hanging="360.0000000000003"/>
+      </w:pPr>
+      <w:r>
+        <w:rPr>
+          <w:i w:val="1"/>
+          <w:iCs w:val="1"/>
+          <w:rtl w:val="0"/>
+        </w:rPr>
+        <w:t xml:space="preserve">In Abnormal Cases:</w:t>
+      </w:r>
+    </w:p>
+    <w:p>
+      <w:pPr>
+        <w:numPr>
           <w:ilvl w:val="3"/>
           <w:numId w:val="1"/>
         </w:numPr>
@@ -17846,27 +17850,17 @@
       </w:pPr>
       <w:r>
         <w:rPr>
-          <w:rtl w:val="0"/>
-        </w:rPr>
-        <w:t xml:space="preserve">When the bank webhook reports a matching incoming transfer, the system reconciles it against the corresponding ledger entry and updates the debt to settle in real time, notifying both parties.</w:t>
-      </w:r>
-    </w:p>
-    <w:p>
-      <w:pPr>
-        <w:numPr>
-          <w:ilvl w:val="2"/>
-          <w:numId w:val="1"/>
-        </w:numPr>
-        <w:spacing w:after="0" w:afterAutospacing="0" w:line="276" w:lineRule="auto"/>
-        <w:ind w:left="1559.0551181102362" w:hanging="360.0000000000003"/>
-      </w:pPr>
-      <w:r>
-        <w:rPr>
-          <w:i w:val="1"/>
-          <w:iCs w:val="1"/>
-          <w:rtl w:val="0"/>
-        </w:rPr>
-        <w:t xml:space="preserve">In Abnormal Cases:</w:t>
+          <w:i w:val="1"/>
+          <w:iCs w:val="1"/>
+          <w:rtl w:val="0"/>
+        </w:rPr>
+        <w:t xml:space="preserve">Debt already settled:</w:t>
+      </w:r>
+      <w:r>
+        <w:rPr>
+          <w:rtl w:val="0"/>
+        </w:rPr>
+        <w:t xml:space="preserve"> The system hides the QR and shows the settlement timestamp instead.</w:t>
       </w:r>
     </w:p>
     <w:p>
@@ -17875,7 +17869,7 @@
           <w:ilvl w:val="3"/>
           <w:numId w:val="1"/>
         </w:numPr>
-        <w:spacing w:after="0" w:afterAutospacing="0" w:before="0" w:beforeAutospacing="0" w:line="276" w:lineRule="auto"/>
+        <w:spacing w:after="240" w:before="0" w:beforeAutospacing="0" w:line="276" w:lineRule="auto"/>
         <w:ind w:left="1984.251968503937" w:hanging="360"/>
         <w:rPr>
           <w:rFonts w:ascii="Noto Sans Symbols" w:cs="Noto Sans Symbols" w:eastAsia="Noto Sans Symbols" w:hAnsi="Noto Sans Symbols"/>
@@ -17887,33 +17881,6 @@
           <w:iCs w:val="1"/>
           <w:rtl w:val="0"/>
         </w:rPr>
-        <w:t xml:space="preserve">Debt already settled:</w:t>
-      </w:r>
-      <w:r>
-        <w:rPr>
-          <w:rtl w:val="0"/>
-        </w:rPr>
-        <w:t xml:space="preserve"> The system hides the QR and shows the settlement timestamp instead.</w:t>
-      </w:r>
-    </w:p>
-    <w:p>
-      <w:pPr>
-        <w:numPr>
-          <w:ilvl w:val="3"/>
-          <w:numId w:val="1"/>
-        </w:numPr>
-        <w:spacing w:after="0" w:afterAutospacing="0" w:before="0" w:beforeAutospacing="0" w:line="276" w:lineRule="auto"/>
-        <w:ind w:left="1984.251968503937" w:hanging="360"/>
-        <w:rPr>
-          <w:rFonts w:ascii="Noto Sans Symbols" w:cs="Noto Sans Symbols" w:eastAsia="Noto Sans Symbols" w:hAnsi="Noto Sans Symbols"/>
-        </w:rPr>
-      </w:pPr>
-      <w:r>
-        <w:rPr>
-          <w:i w:val="1"/>
-          <w:iCs w:val="1"/>
-          <w:rtl w:val="0"/>
-        </w:rPr>
         <w:t xml:space="preserve">QR generation error:</w:t>
       </w:r>
       <w:r>
@@ -17921,47 +17888,6 @@
           <w:rtl w:val="0"/>
         </w:rPr>
         <w:t xml:space="preserve"> The system falls back to displaying the recipient's bank name, account number, account holder name, and reference code as copyable text.</w:t>
-      </w:r>
-    </w:p>
-    <w:p>
-      <w:pPr>
-        <w:numPr>
-          <w:ilvl w:val="3"/>
-          <w:numId w:val="1"/>
-        </w:numPr>
-        <w:spacing w:after="0" w:before="0" w:line="276" w:lineRule="auto"/>
-        <w:ind w:left="1984.251968503937" w:hanging="360"/>
-        <w:rPr>
-          <w:rFonts w:ascii="Noto Sans Symbols" w:cs="Noto Sans Symbols" w:eastAsia="Noto Sans Symbols" w:hAnsi="Noto Sans Symbols"/>
-        </w:rPr>
-      </w:pPr>
-      <w:r>
-        <w:rPr>
-          <w:i w:val="1"/>
-          <w:iCs w:val="1"/>
-          <w:rtl w:val="0"/>
-        </w:rPr>
-        <w:t xml:space="preserve">Webhook not received:</w:t>
-      </w:r>
-      <w:r>
-        <w:rPr>
-          <w:rtl w:val="0"/>
-        </w:rPr>
-        <w:t xml:space="preserve"> The debt remains open and the Payer may proceed through </w:t>
-      </w:r>
-      <w:r>
-        <w:rPr>
-          <w:i w:val="1"/>
-          <w:iCs w:val="1"/>
-          <w:rtl w:val="0"/>
-        </w:rPr>
-        <w:t xml:space="preserve">Submit Payment Proof</w:t>
-      </w:r>
-      <w:r>
-        <w:rPr>
-          <w:rtl w:val="0"/>
-        </w:rPr>
-        <w:t xml:space="preserve">, or the Creditor may confirm receipt manually.</w:t>
       </w:r>
       <w:r>
         <w:rPr>
@@ -18255,6 +18181,25 @@
     <w:p>
       <w:pPr>
         <w:numPr>
+          <w:ilvl w:val="3"/>
+          <w:numId w:val="1"/>
+        </w:numPr>
+        <w:spacing w:after="0" w:afterAutospacing="0" w:before="0" w:beforeAutospacing="0" w:line="276" w:lineRule="auto"/>
+        <w:ind w:left="1984.251968503937" w:hanging="360"/>
+        <w:rPr>
+          <w:u w:val="none"/>
+        </w:rPr>
+      </w:pPr>
+      <w:r>
+        <w:rPr>
+          <w:rtl w:val="0"/>
+        </w:rPr>
+        <w:t xml:space="preserve">The system stops sending automated debt reminders to the Payer for this specific bill.</w:t>
+      </w:r>
+    </w:p>
+    <w:p>
+      <w:pPr>
+        <w:numPr>
           <w:ilvl w:val="2"/>
           <w:numId w:val="1"/>
         </w:numPr>
@@ -18420,7 +18365,7 @@
         <w:rPr>
           <w:rtl w:val="0"/>
         </w:rPr>
-        <w:t xml:space="preserve">Closes an outstanding debt in the ledger when automatic reconciliation is unavailable.</w:t>
+        <w:t xml:space="preserve">Manually closes an outstanding debt in the ledger after the Creditor verifies the fund transfer in their personal banking application.</w:t>
       </w:r>
     </w:p>
     <w:p>
@@ -18537,7 +18482,67 @@
         <w:rPr>
           <w:rtl w:val="0"/>
         </w:rPr>
-        <w:t xml:space="preserve">The Creditor reviews the pending payment and confirms receipt.</w:t>
+        <w:t xml:space="preserve">The Creditor reviews the pending payment (often after the Payer has marked it as "Paid") and manually confirms receipt based on their actual bank statement.</w:t>
+      </w:r>
+    </w:p>
+    <w:p>
+      <w:pPr>
+        <w:keepNext w:val="0"/>
+        <w:keepLines w:val="0"/>
+        <w:pageBreakBefore w:val="0"/>
+        <w:widowControl w:val="1"/>
+        <w:numPr>
+          <w:ilvl w:val="3"/>
+          <w:numId w:val="1"/>
+        </w:numPr>
+        <w:pBdr>
+          <w:top w:space="0" w:sz="0" w:val="nil"/>
+          <w:left w:space="0" w:sz="0" w:val="nil"/>
+          <w:bottom w:space="0" w:sz="0" w:val="nil"/>
+          <w:right w:space="0" w:sz="0" w:val="nil"/>
+          <w:between w:space="0" w:sz="0" w:val="nil"/>
+        </w:pBdr>
+        <w:shd w:fill="auto" w:val="clear"/>
+        <w:spacing w:after="0" w:afterAutospacing="0" w:before="0" w:beforeAutospacing="0" w:line="276" w:lineRule="auto"/>
+        <w:ind w:left="1984.251968503937" w:right="0" w:hanging="360"/>
+        <w:jc w:val="left"/>
+        <w:rPr>
+          <w:rFonts w:ascii="Noto Sans Symbols" w:cs="Noto Sans Symbols" w:eastAsia="Noto Sans Symbols" w:hAnsi="Noto Sans Symbols"/>
+        </w:rPr>
+      </w:pPr>
+      <w:r>
+        <w:rPr>
+          <w:rtl w:val="0"/>
+        </w:rPr>
+        <w:t xml:space="preserve">The system writes a balanced settlement entry to the ledger, moving the debt to </w:t>
+      </w:r>
+      <w:r>
+        <w:rPr>
+          <w:rFonts w:ascii="Roboto Mono" w:cs="Roboto Mono" w:eastAsia="Roboto Mono" w:hAnsi="Roboto Mono"/>
+          <w:color w:val="188038"/>
+          <w:rtl w:val="0"/>
+        </w:rPr>
+        <w:t xml:space="preserve">SETTLED</w:t>
+      </w:r>
+      <w:r>
+        <w:rPr>
+          <w:rtl w:val="0"/>
+        </w:rPr>
+        <w:t xml:space="preserve"> (or </w:t>
+      </w:r>
+      <w:r>
+        <w:rPr>
+          <w:rFonts w:ascii="Roboto Mono" w:cs="Roboto Mono" w:eastAsia="Roboto Mono" w:hAnsi="Roboto Mono"/>
+          <w:color w:val="188038"/>
+          <w:rtl w:val="0"/>
+        </w:rPr>
+        <w:t xml:space="preserve">COMPLETED</w:t>
+      </w:r>
+      <w:r>
+        <w:rPr>
+          <w:rtl w:val="0"/>
+        </w:rPr>
+        <w:t xml:space="preserve">).</w:t>
       </w:r>
     </w:p>
     <w:p>
@@ -18556,21 +18561,7 @@
         <w:rPr>
           <w:rtl w:val="0"/>
         </w:rPr>
-        <w:t xml:space="preserve">The system writes a balanced settlement entry to the ledger, moving the debt to </w:t>
-      </w:r>
-      <w:r>
-        <w:rPr>
-          <w:rFonts w:ascii="Roboto Mono" w:cs="Roboto Mono" w:eastAsia="Roboto Mono" w:hAnsi="Roboto Mono"/>
-          <w:color w:val="188038"/>
-          <w:rtl w:val="0"/>
-        </w:rPr>
-        <w:t xml:space="preserve">SETTLED</w:t>
-      </w:r>
-      <w:r>
-        <w:rPr>
-          <w:rtl w:val="0"/>
-        </w:rPr>
-        <w:t xml:space="preserve">.</w:t>
+        <w:t xml:space="preserve">The system recomputes the group balances purely from the ledger entries — balances are always derived, never stored directly.</w:t>
       </w:r>
     </w:p>
     <w:p>
@@ -18582,14 +18573,14 @@
         <w:spacing w:after="0" w:afterAutospacing="0" w:before="0" w:beforeAutospacing="0" w:line="276" w:lineRule="auto"/>
         <w:ind w:left="1984.251968503937" w:hanging="360"/>
         <w:rPr>
-          <w:rFonts w:ascii="Noto Sans Symbols" w:cs="Noto Sans Symbols" w:eastAsia="Noto Sans Symbols" w:hAnsi="Noto Sans Symbols"/>
-        </w:rPr>
-      </w:pPr>
-      <w:r>
-        <w:rPr>
-          <w:rtl w:val="0"/>
-        </w:rPr>
-        <w:t xml:space="preserve">The system recomputes the group balances from the ledger entries — balances are always derived, never stored directly — and notifies the Payer.</w:t>
+          <w:u w:val="none"/>
+        </w:rPr>
+      </w:pPr>
+      <w:r>
+        <w:rPr>
+          <w:rtl w:val="0"/>
+        </w:rPr>
+        <w:t xml:space="preserve">The system sends a single push notification to the Payer to confirm that the Creditor has successfully received the payment.</w:t>
       </w:r>
     </w:p>
     <w:p>
@@ -18655,33 +18646,6 @@
           <w:iCs w:val="1"/>
           <w:rtl w:val="0"/>
         </w:rPr>
-        <w:t xml:space="preserve">Debt already settled by an incoming webhook:</w:t>
-      </w:r>
-      <w:r>
-        <w:rPr>
-          <w:rtl w:val="0"/>
-        </w:rPr>
-        <w:t xml:space="preserve"> The operation is treated as idempotent; no duplicate settlement entry is created.</w:t>
-      </w:r>
-    </w:p>
-    <w:p>
-      <w:pPr>
-        <w:numPr>
-          <w:ilvl w:val="3"/>
-          <w:numId w:val="1"/>
-        </w:numPr>
-        <w:spacing w:after="0" w:afterAutospacing="0" w:before="0" w:beforeAutospacing="0" w:line="276" w:lineRule="auto"/>
-        <w:ind w:left="1984.251968503937" w:hanging="360"/>
-        <w:rPr>
-          <w:rFonts w:ascii="Noto Sans Symbols" w:cs="Noto Sans Symbols" w:eastAsia="Noto Sans Symbols" w:hAnsi="Noto Sans Symbols"/>
-        </w:rPr>
-      </w:pPr>
-      <w:r>
-        <w:rPr>
-          <w:i w:val="1"/>
-          <w:iCs w:val="1"/>
-          <w:rtl w:val="0"/>
-        </w:rPr>
         <w:t xml:space="preserve">Confirmation issued in error:</w:t>
       </w:r>
       <w:r>
@@ -18715,7 +18679,7 @@
         <w:rPr>
           <w:rtl w:val="0"/>
         </w:rPr>
-        <w:t xml:space="preserve"> The system shows an error message, retains the previous debt status, and asks the user to retry.</w:t>
+        <w:t xml:space="preserve"> The system rolls back the transaction, shows an error message, retains the previous debt status, and asks the user to retry.</w:t>
       </w:r>
       <w:r>
         <w:rPr>
@@ -19897,7 +19861,7 @@
         <w:rPr>
           <w:rtl w:val="0"/>
         </w:rPr>
-        <w:t xml:space="preserve">The system continuously collects operational metrics: request volume, latency histograms per endpoint, error rates by status class, background job queue depth and job failure rate, OCR extraction success rate and average duration, and webhook reconciliation success rate.</w:t>
+        <w:t xml:space="preserve">The system continuously collects operational metrics: request volume, latency histograms per endpoint, error rates by status class, background job queue depth and job failure rate, and OCR extraction success rate.</w:t>
       </w:r>
     </w:p>
     <w:p>
@@ -21461,6 +21425,66 @@
           <w:ilvl w:val="1"/>
           <w:numId w:val="20"/>
         </w:numPr>
+        <w:spacing w:after="60" w:afterAutospacing="0" w:line="240" w:lineRule="auto"/>
+        <w:ind w:left="1440" w:hanging="360"/>
+        <w:rPr>
+          <w:b w:val="1"/>
+          <w:bCs w:val="1"/>
+          <w:i w:val="1"/>
+          <w:iCs w:val="1"/>
+        </w:rPr>
+      </w:pPr>
+      <w:r>
+        <w:rPr>
+          <w:b w:val="1"/>
+          <w:bCs w:val="1"/>
+          <w:rtl w:val="0"/>
+        </w:rPr>
+        <w:t xml:space="preserve">Notification:</w:t>
+      </w:r>
+      <w:r>
+        <w:rPr>
+          <w:rtl w:val="0"/>
+        </w:rPr>
+        <w:t xml:space="preserve"> Dispatches push notifications (FCM) for reminders and status updates.</w:t>
+      </w:r>
+      <w:r>
+        <w:rPr>
+          <w:rtl w:val="0"/>
+        </w:rPr>
+      </w:r>
+    </w:p>
+    <w:p>
+      <w:pPr>
+        <w:keepNext w:val="0"/>
+        <w:keepLines w:val="0"/>
+        <w:numPr>
+          <w:ilvl w:val="0"/>
+          <w:numId w:val="2"/>
+        </w:numPr>
+        <w:spacing w:after="0" w:afterAutospacing="0" w:before="60" w:beforeAutospacing="0" w:line="240" w:lineRule="auto"/>
+        <w:ind w:left="720" w:hanging="360"/>
+        <w:rPr>
+          <w:u w:val="none"/>
+        </w:rPr>
+      </w:pPr>
+      <w:r>
+        <w:rPr>
+          <w:b w:val="1"/>
+          <w:bCs w:val="1"/>
+          <w:i w:val="1"/>
+          <w:iCs w:val="1"/>
+          <w:rtl w:val="0"/>
+        </w:rPr>
+        <w:t xml:space="preserve">Async Workers</w:t>
+      </w:r>
+    </w:p>
+    <w:p>
+      <w:pPr>
+        <w:numPr>
+          <w:ilvl w:val="1"/>
+          <w:numId w:val="2"/>
+        </w:numPr>
         <w:spacing w:after="60" w:line="240" w:lineRule="auto"/>
         <w:ind w:left="1440" w:hanging="360"/>
         <w:rPr>
@@ -21476,67 +21500,53 @@
           <w:bCs w:val="1"/>
           <w:rtl w:val="0"/>
         </w:rPr>
-        <w:t xml:space="preserve">Notification:</w:t>
-      </w:r>
-      <w:r>
-        <w:rPr>
-          <w:rtl w:val="0"/>
-        </w:rPr>
-        <w:t xml:space="preserve"> Dispatches push notifications (FCM) for reminders and status updates.</w:t>
-      </w:r>
-      <w:r>
-        <w:rPr>
-          <w:rtl w:val="0"/>
-        </w:rPr>
-      </w:r>
-    </w:p>
-    <w:p>
-      <w:pPr>
-        <w:pBdr>
-          <w:left w:color="4472c4" w:space="0" w:sz="6" w:val="single"/>
-        </w:pBdr>
-        <w:shd w:fill="f2f2f2" w:val="clear"/>
-        <w:spacing w:after="120" w:before="120" w:line="240" w:lineRule="auto"/>
-        <w:ind w:left="431" w:right="431" w:firstLine="0"/>
-        <w:rPr/>
-      </w:pPr>
-      <w:r>
-        <w:rPr>
-          <w:i w:val="1"/>
-          <w:iCs w:val="1"/>
-          <w:rtl w:val="0"/>
-        </w:rPr>
-        <w:t xml:space="preserve">Payment confirmation is fully manual: the debtor marks the debt as "paid," and/or the creditor checks their banking app and taps "confirm received" to close the ledger entry.</w:t>
-      </w:r>
-      <w:r>
-        <w:rPr>
-          <w:rtl w:val="0"/>
-        </w:rPr>
-      </w:r>
-    </w:p>
-    <w:p>
-      <w:pPr>
-        <w:keepNext w:val="0"/>
-        <w:keepLines w:val="0"/>
-        <w:numPr>
-          <w:ilvl w:val="0"/>
+        <w:t xml:space="preserve">OCR Worker</w:t>
+      </w:r>
+      <w:r>
+        <w:rPr>
+          <w:rtl w:val="0"/>
+        </w:rPr>
+        <w:t xml:space="preserve">: consumes OCR jobs from the queue, calls the Vision LLM provider, retries with backoff.</w:t>
+      </w:r>
+      <w:r>
+        <w:rPr>
+          <w:rtl w:val="0"/>
+        </w:rPr>
+      </w:r>
+    </w:p>
+    <w:p>
+      <w:pPr>
+        <w:numPr>
+          <w:ilvl w:val="1"/>
           <w:numId w:val="2"/>
         </w:numPr>
-        <w:spacing w:after="0" w:afterAutospacing="0" w:before="240" w:line="240" w:lineRule="auto"/>
-        <w:ind w:left="720" w:hanging="360"/>
-        <w:rPr>
-          <w:u w:val="none"/>
-        </w:rPr>
-      </w:pPr>
-      <w:r>
+        <w:spacing w:after="60" w:line="240" w:lineRule="auto"/>
+        <w:ind w:left="1440" w:hanging="360"/>
         <w:rPr>
           <w:b w:val="1"/>
           <w:bCs w:val="1"/>
           <w:i w:val="1"/>
           <w:iCs w:val="1"/>
-          <w:rtl w:val="0"/>
-        </w:rPr>
-        <w:t xml:space="preserve">Async Workers</w:t>
+        </w:rPr>
+      </w:pPr>
+      <w:r>
+        <w:rPr>
+          <w:b w:val="1"/>
+          <w:bCs w:val="1"/>
+          <w:rtl w:val="0"/>
+        </w:rPr>
+        <w:t xml:space="preserve">Job Queue</w:t>
+      </w:r>
+      <w:r>
+        <w:rPr>
+          <w:rtl w:val="0"/>
+        </w:rPr>
+        <w:t xml:space="preserve">: River (Postgres-backed), also used for QR generation and notification delivery.</w:t>
+      </w:r>
+      <w:r>
+        <w:rPr>
+          <w:rtl w:val="0"/>
+        </w:rPr>
       </w:r>
     </w:p>
     <w:p>
@@ -21545,7 +21555,7 @@
           <w:ilvl w:val="1"/>
           <w:numId w:val="2"/>
         </w:numPr>
-        <w:spacing w:after="60" w:line="240" w:lineRule="auto"/>
+        <w:spacing w:after="60" w:afterAutospacing="0" w:line="240" w:lineRule="auto"/>
         <w:ind w:left="1440" w:hanging="360"/>
         <w:rPr>
           <w:b w:val="1"/>
@@ -21560,83 +21570,27 @@
           <w:bCs w:val="1"/>
           <w:rtl w:val="0"/>
         </w:rPr>
-        <w:t xml:space="preserve">OCR Worker</w:t>
-      </w:r>
-      <w:r>
-        <w:rPr>
-          <w:rtl w:val="0"/>
-        </w:rPr>
-        <w:t xml:space="preserve">: consumes OCR jobs from the queue, calls the Vision LLM provider, retries with backoff.</w:t>
-      </w:r>
-      <w:r>
-        <w:rPr>
-          <w:rtl w:val="0"/>
-        </w:rPr>
-      </w:r>
-    </w:p>
-    <w:p>
-      <w:pPr>
-        <w:numPr>
-          <w:ilvl w:val="1"/>
-          <w:numId w:val="2"/>
-        </w:numPr>
-        <w:spacing w:after="60" w:line="240" w:lineRule="auto"/>
-        <w:ind w:left="1440" w:hanging="360"/>
-        <w:rPr>
-          <w:b w:val="1"/>
-          <w:bCs w:val="1"/>
-          <w:i w:val="1"/>
-          <w:iCs w:val="1"/>
-        </w:rPr>
-      </w:pPr>
-      <w:r>
-        <w:rPr>
-          <w:b w:val="1"/>
-          <w:bCs w:val="1"/>
-          <w:rtl w:val="0"/>
-        </w:rPr>
-        <w:t xml:space="preserve">Job Queue</w:t>
-      </w:r>
-      <w:r>
-        <w:rPr>
-          <w:rtl w:val="0"/>
-        </w:rPr>
-        <w:t xml:space="preserve">: River (Postgres-backed), also used for QR generation and notification delivery.</w:t>
-      </w:r>
-      <w:r>
-        <w:rPr>
-          <w:rtl w:val="0"/>
-        </w:rPr>
-      </w:r>
-    </w:p>
-    <w:p>
-      <w:pPr>
-        <w:numPr>
-          <w:ilvl w:val="1"/>
-          <w:numId w:val="2"/>
-        </w:numPr>
-        <w:spacing w:after="60" w:afterAutospacing="0" w:line="240" w:lineRule="auto"/>
-        <w:ind w:left="1440" w:hanging="360"/>
-        <w:rPr>
-          <w:b w:val="1"/>
-          <w:bCs w:val="1"/>
-          <w:i w:val="1"/>
-          <w:iCs w:val="1"/>
-        </w:rPr>
-      </w:pPr>
-      <w:r>
-        <w:rPr>
-          <w:b w:val="1"/>
-          <w:bCs w:val="1"/>
-          <w:rtl w:val="0"/>
-        </w:rPr>
         <w:t xml:space="preserve">Reminder Scheduler</w:t>
       </w:r>
       <w:r>
         <w:rPr>
           <w:rtl w:val="0"/>
         </w:rPr>
-        <w:t xml:space="preserve">: cron-style jobs for payment reminders and the 3-day auto-complete rule.</w:t>
+        <w:t xml:space="preserve">: cron-style jobs for payment reminders and the N-times reminder rule (transitions stale pending payments to </w:t>
+      </w:r>
+      <w:r>
+        <w:rPr>
+          <w:rFonts w:ascii="Roboto Mono" w:cs="Roboto Mono" w:eastAsia="Roboto Mono" w:hAnsi="Roboto Mono"/>
+          <w:color w:val="188038"/>
+          <w:rtl w:val="0"/>
+        </w:rPr>
+        <w:t xml:space="preserve">STALLED_CONFIRMATION</w:t>
+      </w:r>
+      <w:r>
+        <w:rPr>
+          <w:rtl w:val="0"/>
+        </w:rPr>
+        <w:t xml:space="preserve"> without auto-completing).</w:t>
       </w:r>
       <w:r>
         <w:rPr>
@@ -22352,7 +22306,7 @@
                 <w:color w:val="333333"/>
                 <w:rtl w:val="0"/>
               </w:rPr>
-              <w:t xml:space="preserve">Go testing + testify; Split &amp; Settlement Engines fully unit-testable without mocks</w:t>
+              <w:t xml:space="preserve">Go testing + testify</w:t>
             </w:r>
             <w:r>
               <w:rPr>
@@ -22503,7 +22457,7 @@
     <w:sdt>
       <w:sdtPr>
         <w:lock w:val="contentLocked"/>
-        <w:id w:val="1278034709"/>
+        <w:id w:val="1857915569"/>
         <w:tag w:val="goog_rdk_1"/>
       </w:sdtPr>
       <w:sdtContent>
@@ -22785,7 +22739,7 @@
                   <w:rPr>
                     <w:rtl w:val="0"/>
                   </w:rPr>
-                  <w:t xml:space="preserve">•  Split Engine with unit tests</w:t>
+                  <w:t xml:space="preserve">•  Split Controller with unit tests</w:t>
                 </w:r>
                 <w:r>
                   <w:rPr>
@@ -22896,7 +22850,7 @@
                   <w:rPr>
                     <w:rtl w:val="0"/>
                   </w:rPr>
-                  <w:t xml:space="preserve">•  Ledger + Settlement Engine integrated</w:t>
+                  <w:t xml:space="preserve">•  Ledger + Settlement Controller integrated</w:t>
                 </w:r>
                 <w:r>
                   <w:rPr>
@@ -23117,7 +23071,7 @@
     <w:sdt>
       <w:sdtPr>
         <w:lock w:val="contentLocked"/>
-        <w:id w:val="650494672"/>
+        <w:id w:val="2011571671"/>
         <w:tag w:val="goog_rdk_2"/>
       </w:sdtPr>
       <w:sdtContent>
@@ -23703,7 +23657,7 @@
                   <w:rPr>
                     <w:rtl w:val="0"/>
                   </w:rPr>
-                  <w:t xml:space="preserve">Enforce int64 VND arithmetic (never float64); Hamilton rounding; pure-logic engines enable 100% deterministic unit tests.</w:t>
+                  <w:t xml:space="preserve">Enforce int64 VND arithmetic (never float64); Hamilton rounding; pure-logic controller enable 100% deterministic unit tests.</w:t>
                 </w:r>
                 <w:r>
                   <w:rPr>

</xml_diff>

<commit_message>
Lampt update fix doc
</commit_message>
<xml_diff>
--- a/Report1_Product_Requirement_Document.docx
+++ b/Report1_Product_Requirement_Document.docx
@@ -14,12 +14,12 @@
           <wp:inline distB="114300" distT="114300" distL="114300" distR="114300">
             <wp:extent cx="2733675" cy="1148612"/>
             <wp:effectExtent b="0" l="0" r="0" t="0"/>
-            <wp:docPr id="8" name="image4.png"/>
+            <wp:docPr id="8" name="image2.png"/>
             <a:graphic>
               <a:graphicData uri="http://schemas.openxmlformats.org/drawingml/2006/picture">
                 <pic:pic>
                   <pic:nvPicPr>
-                    <pic:cNvPr id="0" name="image4.png"/>
+                    <pic:cNvPr id="0" name="image2.png"/>
                     <pic:cNvPicPr preferRelativeResize="0"/>
                   </pic:nvPicPr>
                   <pic:blipFill>
@@ -148,7 +148,7 @@
     <w:sdt>
       <w:sdtPr>
         <w:lock w:val="contentLocked"/>
-        <w:id w:val="269641364"/>
+        <w:id w:val="-599733949"/>
         <w:tag w:val="goog_rdk_0"/>
       </w:sdtPr>
       <w:sdtContent>
@@ -730,7 +730,7 @@
     </w:p>
     <w:sdt>
       <w:sdtPr>
-        <w:id w:val="1875544232"/>
+        <w:id w:val="-1258053492"/>
         <w:docPartObj>
           <w:docPartGallery w:val="Table of Contents"/>
           <w:docPartUnique w:val="1"/>
@@ -3256,7 +3256,7 @@
     </w:p>
     <w:sdt>
       <w:sdtPr>
-        <w:id w:val="-2112336103"/>
+        <w:id w:val="-1681673261"/>
         <w:docPartObj>
           <w:docPartGallery w:val="Table of Contents"/>
           <w:docPartUnique w:val="1"/>
@@ -3558,7 +3558,7 @@
     </w:p>
     <w:sdt>
       <w:sdtPr>
-        <w:id w:val="2003466682"/>
+        <w:id w:val="-1904739586"/>
         <w:docPartObj>
           <w:docPartGallery w:val="Table of Contents"/>
           <w:docPartUnique w:val="1"/>
@@ -5601,12 +5601,12 @@
           <wp:inline distB="114300" distT="114300" distL="114300" distR="114300">
             <wp:extent cx="5781788" cy="3835814"/>
             <wp:effectExtent b="0" l="0" r="0" t="0"/>
-            <wp:docPr id="12" name="image5.png"/>
+            <wp:docPr id="12" name="image6.png"/>
             <a:graphic>
               <a:graphicData uri="http://schemas.openxmlformats.org/drawingml/2006/picture">
                 <pic:pic>
                   <pic:nvPicPr>
-                    <pic:cNvPr id="0" name="image5.png"/>
+                    <pic:cNvPr id="0" name="image6.png"/>
                     <pic:cNvPicPr preferRelativeResize="0"/>
                   </pic:nvPicPr>
                   <pic:blipFill>
@@ -5652,7 +5652,7 @@
         <w:rPr>
           <w:rtl w:val="0"/>
         </w:rPr>
-        <w:t xml:space="preserve">Figure 1. Money Laundering Cycle</w:t>
+        <w:t xml:space="preserve">Figure 1. Traditional Expense Splitting Cycle</w:t>
       </w:r>
       <w:r>
         <w:rPr>
@@ -6278,12 +6278,12 @@
           <wp:inline distB="114300" distT="114300" distL="114300" distR="114300">
             <wp:extent cx="5305538" cy="2981624"/>
             <wp:effectExtent b="0" l="0" r="0" t="0"/>
-            <wp:docPr id="7" name="image6.png"/>
+            <wp:docPr id="7" name="image5.png"/>
             <a:graphic>
               <a:graphicData uri="http://schemas.openxmlformats.org/drawingml/2006/picture">
                 <pic:pic>
                   <pic:nvPicPr>
-                    <pic:cNvPr id="0" name="image6.png"/>
+                    <pic:cNvPr id="0" name="image5.png"/>
                     <pic:cNvPicPr preferRelativeResize="0"/>
                   </pic:nvPicPr>
                   <pic:blipFill>
@@ -6478,7 +6478,7 @@
         <w:rPr>
           <w:rtl w:val="0"/>
         </w:rPr>
-        <w:t xml:space="preserve"> Track statuses (Awaiting, Pending, Confirmed) where payers mark transfers as sent, but </w:t>
+        <w:t xml:space="preserve"> Track statuses where payers mark transfers as sent, but </w:t>
       </w:r>
       <w:r>
         <w:rPr>
@@ -8254,12 +8254,12 @@
           <wp:inline distB="114300" distT="114300" distL="114300" distR="114300">
             <wp:extent cx="5136803" cy="5264162"/>
             <wp:effectExtent b="0" l="0" r="0" t="0"/>
-            <wp:docPr id="11" name="image2.png"/>
+            <wp:docPr id="11" name="image3.png"/>
             <a:graphic>
               <a:graphicData uri="http://schemas.openxmlformats.org/drawingml/2006/picture">
                 <pic:pic>
                   <pic:nvPicPr>
-                    <pic:cNvPr id="0" name="image2.png"/>
+                    <pic:cNvPr id="0" name="image3.png"/>
                     <pic:cNvPicPr preferRelativeResize="0"/>
                   </pic:nvPicPr>
                   <pic:blipFill>
@@ -8316,12 +8316,12 @@
           <wp:inline distB="114300" distT="114300" distL="114300" distR="114300">
             <wp:extent cx="3049005" cy="2589309"/>
             <wp:effectExtent b="0" l="0" r="0" t="0"/>
-            <wp:docPr id="10" name="image3.png"/>
+            <wp:docPr id="10" name="image4.png"/>
             <a:graphic>
               <a:graphicData uri="http://schemas.openxmlformats.org/drawingml/2006/picture">
                 <pic:pic>
                   <pic:nvPicPr>
-                    <pic:cNvPr id="0" name="image3.png"/>
+                    <pic:cNvPr id="0" name="image4.png"/>
                     <pic:cNvPicPr preferRelativeResize="0"/>
                   </pic:nvPicPr>
                   <pic:blipFill>
@@ -10744,7 +10744,7 @@
               <w:rPr>
                 <w:rtl w:val="0"/>
               </w:rPr>
-              <w:t xml:space="preserve">- Displays the individual VietQR code for the Payer's debt so that it can be scanned or opened in a banking application. The QR encodes the recipient account, the exact amount, and the unique reference code used for automatic reconciliation.</w:t>
+              <w:t xml:space="preserve">- Displays the individual VietQR code for the Payer's debt so that it can be scanned or opened in a banking application. The QR encodes the recipient account, the exact amount.</w:t>
             </w:r>
           </w:p>
         </w:tc>
@@ -17120,32 +17120,10 @@
         </w:rPr>
         <w:t xml:space="preserve">In Abnormal Cases:</w:t>
       </w:r>
-    </w:p>
-    <w:p>
-      <w:pPr>
-        <w:numPr>
-          <w:ilvl w:val="3"/>
-          <w:numId w:val="1"/>
-        </w:numPr>
-        <w:spacing w:after="0" w:afterAutospacing="0" w:before="0" w:beforeAutospacing="0" w:line="276" w:lineRule="auto"/>
-        <w:ind w:left="1984.251968503937" w:hanging="360"/>
-        <w:rPr>
-          <w:rFonts w:ascii="Noto Sans Symbols" w:cs="Noto Sans Symbols" w:eastAsia="Noto Sans Symbols" w:hAnsi="Noto Sans Symbols"/>
-        </w:rPr>
-      </w:pPr>
-      <w:r>
-        <w:rPr>
-          <w:i w:val="1"/>
-          <w:iCs w:val="1"/>
-          <w:rtl w:val="0"/>
-        </w:rPr>
-        <w:t xml:space="preserve">Creditor has no valid bank account:</w:t>
-      </w:r>
-      <w:r>
-        <w:rPr>
-          <w:rtl w:val="0"/>
-        </w:rPr>
-        <w:t xml:space="preserve"> Return HTTP 409 and prompt the Admin to require the Creditor to complete their banking details before finalizing.</w:t>
+      <w:r>
+        <w:rPr>
+          <w:rtl w:val="0"/>
+        </w:rPr>
       </w:r>
     </w:p>
     <w:p>
@@ -18233,13 +18211,12 @@
           <w:iCs w:val="1"/>
           <w:rtl w:val="0"/>
         </w:rPr>
-        <w:t xml:space="preserve">Debt already reconciled automatically:</w:t>
-      </w:r>
-      <w:r>
-        <w:rPr>
-          <w:rtl w:val="0"/>
-        </w:rPr>
-        <w:t xml:space="preserve"> The system informs the Payer that the payment has already been recognized and takes no further action.</w:t>
+        <w:t xml:space="preserve">Debt already reconciled:The system notifies the Payer that the payment has been recorded and stores the attached image pending review and confirmation by the creditor.</w:t>
+      </w:r>
+      <w:r>
+        <w:rPr>
+          <w:rtl w:val="0"/>
+        </w:rPr>
       </w:r>
     </w:p>
     <w:p>
@@ -18266,7 +18243,7 @@
         <w:rPr>
           <w:rtl w:val="0"/>
         </w:rPr>
-        <w:t xml:space="preserve"> The system updates the existing pending record rather than creating a second one.</w:t>
+        <w:t xml:space="preserve"> The system updates the existing pending record instead of creating a new one.</w:t>
       </w:r>
       <w:r>
         <w:rPr>
@@ -22457,7 +22434,7 @@
     <w:sdt>
       <w:sdtPr>
         <w:lock w:val="contentLocked"/>
-        <w:id w:val="1857915569"/>
+        <w:id w:val="1731091420"/>
         <w:tag w:val="goog_rdk_1"/>
       </w:sdtPr>
       <w:sdtContent>
@@ -23071,7 +23048,7 @@
     <w:sdt>
       <w:sdtPr>
         <w:lock w:val="contentLocked"/>
-        <w:id w:val="2011571671"/>
+        <w:id w:val="344870701"/>
         <w:tag w:val="goog_rdk_2"/>
       </w:sdtPr>
       <w:sdtContent>

</xml_diff>

<commit_message>
fix: delete old table auth_identities
</commit_message>
<xml_diff>
--- a/Report1_Product_Requirement_Document.docx
+++ b/Report1_Product_Requirement_Document.docx
@@ -14,12 +14,12 @@
           <wp:inline distB="114300" distT="114300" distL="114300" distR="114300">
             <wp:extent cx="2733675" cy="1148612"/>
             <wp:effectExtent b="0" l="0" r="0" t="0"/>
-            <wp:docPr id="8" name="image3.png"/>
+            <wp:docPr id="8" name="image1.png"/>
             <a:graphic>
               <a:graphicData uri="http://schemas.openxmlformats.org/drawingml/2006/picture">
                 <pic:pic>
                   <pic:nvPicPr>
-                    <pic:cNvPr id="0" name="image3.png"/>
+                    <pic:cNvPr id="0" name="image1.png"/>
                     <pic:cNvPicPr preferRelativeResize="0"/>
                   </pic:nvPicPr>
                   <pic:blipFill>
@@ -148,7 +148,7 @@
     <w:sdt>
       <w:sdtPr>
         <w:lock w:val="contentLocked"/>
-        <w:id w:val="311302628"/>
+        <w:id w:val="1366937640"/>
         <w:tag w:val="goog_rdk_0"/>
       </w:sdtPr>
       <w:sdtContent>
@@ -730,7 +730,7 @@
     </w:p>
     <w:sdt>
       <w:sdtPr>
-        <w:id w:val="-697377605"/>
+        <w:id w:val="2049518544"/>
         <w:docPartObj>
           <w:docPartGallery w:val="Table of Contents"/>
           <w:docPartUnique w:val="1"/>
@@ -3256,7 +3256,7 @@
     </w:p>
     <w:sdt>
       <w:sdtPr>
-        <w:id w:val="471640569"/>
+        <w:id w:val="-1832626629"/>
         <w:docPartObj>
           <w:docPartGallery w:val="Table of Contents"/>
           <w:docPartUnique w:val="1"/>
@@ -3558,7 +3558,7 @@
     </w:p>
     <w:sdt>
       <w:sdtPr>
-        <w:id w:val="1288471790"/>
+        <w:id w:val="290057091"/>
         <w:docPartObj>
           <w:docPartGallery w:val="Table of Contents"/>
           <w:docPartUnique w:val="1"/>
@@ -5601,12 +5601,12 @@
           <wp:inline distB="114300" distT="114300" distL="114300" distR="114300">
             <wp:extent cx="5781788" cy="3835814"/>
             <wp:effectExtent b="0" l="0" r="0" t="0"/>
-            <wp:docPr id="12" name="image6.png"/>
+            <wp:docPr id="12" name="image4.png"/>
             <a:graphic>
               <a:graphicData uri="http://schemas.openxmlformats.org/drawingml/2006/picture">
                 <pic:pic>
                   <pic:nvPicPr>
-                    <pic:cNvPr id="0" name="image6.png"/>
+                    <pic:cNvPr id="0" name="image4.png"/>
                     <pic:cNvPicPr preferRelativeResize="0"/>
                   </pic:nvPicPr>
                   <pic:blipFill>
@@ -6278,12 +6278,12 @@
           <wp:inline distB="114300" distT="114300" distL="114300" distR="114300">
             <wp:extent cx="5305538" cy="2981624"/>
             <wp:effectExtent b="0" l="0" r="0" t="0"/>
-            <wp:docPr id="7" name="image4.png"/>
+            <wp:docPr id="7" name="image5.png"/>
             <a:graphic>
               <a:graphicData uri="http://schemas.openxmlformats.org/drawingml/2006/picture">
                 <pic:pic>
                   <pic:nvPicPr>
-                    <pic:cNvPr id="0" name="image4.png"/>
+                    <pic:cNvPr id="0" name="image5.png"/>
                     <pic:cNvPicPr preferRelativeResize="0"/>
                   </pic:nvPicPr>
                   <pic:blipFill>
@@ -6726,12 +6726,12 @@
           <wp:inline distB="114300" distT="114300" distL="114300" distR="114300">
             <wp:extent cx="5943165" cy="3516782"/>
             <wp:effectExtent b="0" l="0" r="0" t="0"/>
-            <wp:docPr id="9" name="image1.png"/>
+            <wp:docPr id="9" name="image6.png"/>
             <a:graphic>
               <a:graphicData uri="http://schemas.openxmlformats.org/drawingml/2006/picture">
                 <pic:pic>
                   <pic:nvPicPr>
-                    <pic:cNvPr id="0" name="image1.png"/>
+                    <pic:cNvPr id="0" name="image6.png"/>
                     <pic:cNvPicPr preferRelativeResize="0"/>
                   </pic:nvPicPr>
                   <pic:blipFill>
@@ -8254,12 +8254,12 @@
           <wp:inline distB="114300" distT="114300" distL="114300" distR="114300">
             <wp:extent cx="5136803" cy="5264162"/>
             <wp:effectExtent b="0" l="0" r="0" t="0"/>
-            <wp:docPr id="11" name="image2.png"/>
+            <wp:docPr id="11" name="image3.png"/>
             <a:graphic>
               <a:graphicData uri="http://schemas.openxmlformats.org/drawingml/2006/picture">
                 <pic:pic>
                   <pic:nvPicPr>
-                    <pic:cNvPr id="0" name="image2.png"/>
+                    <pic:cNvPr id="0" name="image3.png"/>
                     <pic:cNvPicPr preferRelativeResize="0"/>
                   </pic:nvPicPr>
                   <pic:blipFill>
@@ -8316,12 +8316,12 @@
           <wp:inline distB="114300" distT="114300" distL="114300" distR="114300">
             <wp:extent cx="3049005" cy="2589309"/>
             <wp:effectExtent b="0" l="0" r="0" t="0"/>
-            <wp:docPr id="10" name="image5.png"/>
+            <wp:docPr id="10" name="image2.png"/>
             <a:graphic>
               <a:graphicData uri="http://schemas.openxmlformats.org/drawingml/2006/picture">
                 <pic:pic>
                   <pic:nvPicPr>
-                    <pic:cNvPr id="0" name="image5.png"/>
+                    <pic:cNvPr id="0" name="image2.png"/>
                     <pic:cNvPicPr preferRelativeResize="0"/>
                   </pic:nvPicPr>
                   <pic:blipFill>
@@ -11256,7 +11256,7 @@
               <w:rPr>
                 <w:rtl w:val="0"/>
               </w:rPr>
-              <w:t xml:space="preserve">- Displays the full profile of a selected account, including linked authentication providers, group membership, and recent activity history.</w:t>
+              <w:t xml:space="preserve">- Displays the full profile of a selected account, including account status, group membership, and recent activity history.</w:t>
             </w:r>
           </w:p>
         </w:tc>
@@ -11794,7 +11794,7 @@
         <w:rPr>
           <w:rtl w:val="0"/>
         </w:rPr>
-        <w:t xml:space="preserve">The system locates the corresponding authentication identity and verifies the password hash</w:t>
+        <w:t xml:space="preserve">The system locates the user by email and verifies the password against the hash stored on the user record.</w:t>
       </w:r>
     </w:p>
     <w:p>
@@ -12216,7 +12216,7 @@
         <w:rPr>
           <w:rtl w:val="0"/>
         </w:rPr>
-        <w:t xml:space="preserve">The system creates a user record with a UUID v7 identifier and an associated authentication identity, storing only the password hash.</w:t>
+        <w:t xml:space="preserve">The system creates a user record with a UUID v7 identifier and stores only the password hash.</w:t>
       </w:r>
     </w:p>
     <w:p>
@@ -19193,7 +19193,7 @@
         <w:rPr>
           <w:rtl w:val="0"/>
         </w:rPr>
-        <w:t xml:space="preserve">The system displays the account profile, linked authentication providers, active session count, group membership, and recent activity history.</w:t>
+        <w:t xml:space="preserve">The system displays the account profile, account status, active session count, group membership, and recent activity history.</w:t>
       </w:r>
     </w:p>
     <w:p>
@@ -22434,7 +22434,7 @@
     <w:sdt>
       <w:sdtPr>
         <w:lock w:val="contentLocked"/>
-        <w:id w:val="511345608"/>
+        <w:id w:val="652157014"/>
         <w:tag w:val="goog_rdk_1"/>
       </w:sdtPr>
       <w:sdtContent>
@@ -23048,7 +23048,7 @@
     <w:sdt>
       <w:sdtPr>
         <w:lock w:val="contentLocked"/>
-        <w:id w:val="-252920602"/>
+        <w:id w:val="-1286185664"/>
         <w:tag w:val="goog_rdk_2"/>
       </w:sdtPr>
       <w:sdtContent>

</xml_diff>